<commit_message>
refresh TDS templates and fix font inheritance
</commit_message>
<xml_diff>
--- a/TDS Skill/templates/active/TDS_EN_冠志模板.docx
+++ b/TDS Skill/templates/active/TDS_EN_冠志模板.docx
@@ -13,8 +13,6 @@
           <w:sz w:val="28"/>
         </w:rPr>
       </w:pPr>
-      <w:bookmarkStart w:id="1" w:name="_GoBack"/>
-      <w:bookmarkEnd w:id="1"/>
       <w:bookmarkStart w:id="0" w:name="page1"/>
       <w:bookmarkEnd w:id="0"/>
       <w:r>
@@ -228,14 +226,14 @@
       <w:pPr>
         <w:spacing w:line="0" w:lineRule="atLeast"/>
         <w:rPr>
-          <w:rFonts w:ascii="宋体" w:hAnsi="宋体" w:eastAsia="宋体" w:cs="Times New Roman"/>
+          <w:rFonts w:ascii="Times New Roman" w:hAnsi="Times New Roman" w:cs="Times New Roman"/>
           <w:b/>
           <w:sz w:val="28"/>
         </w:rPr>
       </w:pPr>
       <w:r>
         <w:rPr>
-          <w:rFonts w:ascii="宋体" w:hAnsi="宋体" w:eastAsia="宋体" w:cs="Times New Roman"/>
+          <w:rFonts w:ascii="Times New Roman" w:hAnsi="Times New Roman" w:cs="Times New Roman"/>
           <w:b/>
           <w:sz w:val="28"/>
         </w:rPr>
@@ -246,25 +244,25 @@
       <w:pPr>
         <w:spacing w:line="0" w:lineRule="atLeast"/>
         <w:rPr>
-          <w:rFonts w:ascii="宋体" w:hAnsi="宋体" w:cs="宋体"/>
-          <w:b/>
-          <w:sz w:val="11"/>
-          <w:szCs w:val="4"/>
+          <w:rFonts w:ascii="Times New Roman" w:hAnsi="Times New Roman" w:cs="Times New Roman"/>
+          <w:b/>
+          <w:sz w:val="8"/>
+          <w:szCs w:val="2"/>
         </w:rPr>
       </w:pPr>
     </w:p>
     <w:p>
       <w:pPr>
         <w:spacing w:line="324" w:lineRule="auto"/>
-        <w:ind w:left="0" w:leftChars="0" w:right="0" w:rightChars="0" w:firstLineChars="200"/>
-        <w:rPr>
-          <w:rFonts w:hint="eastAsia" w:ascii="Times New Roman" w:hAnsi="Times New Roman" w:cs="Times New Roman"/>
+        <w:ind w:left="0" w:leftChars="0" w:right="0" w:rightChars="0"/>
+        <w:rPr>
+          <w:rFonts w:ascii="Times New Roman" w:hAnsi="Times New Roman" w:cs="Times New Roman"/>
           <w:sz w:val="24"/>
         </w:rPr>
       </w:pPr>
       <w:r>
         <w:rPr>
-          <w:rFonts w:hint="eastAsia" w:ascii="Times New Roman" w:hAnsi="Times New Roman" w:cs="Times New Roman"/>
+          <w:rFonts w:ascii="Times New Roman" w:hAnsi="Times New Roman" w:cs="Times New Roman"/>
           <w:sz w:val="24"/>
         </w:rPr>
         <w:t>PU-1001 is an aliphatic anionic waterborne polyurethane dispersion with strong adhesion, used to improve interlayer adhesion.</w:t>
@@ -274,14 +272,14 @@
       <w:pPr>
         <w:spacing w:line="0" w:lineRule="atLeast"/>
         <w:rPr>
-          <w:rFonts w:ascii="宋体" w:hAnsi="宋体" w:eastAsia="宋体" w:cs="Times New Roman"/>
+          <w:rFonts w:ascii="Times New Roman" w:hAnsi="Times New Roman" w:cs="Times New Roman"/>
           <w:b/>
           <w:sz w:val="28"/>
         </w:rPr>
       </w:pPr>
       <w:r>
         <w:rPr>
-          <w:rFonts w:ascii="宋体" w:hAnsi="宋体" w:eastAsia="宋体" w:cs="Times New Roman"/>
+          <w:rFonts w:ascii="Times New Roman" w:hAnsi="Times New Roman" w:cs="Times New Roman"/>
           <w:b/>
           <w:sz w:val="28"/>
         </w:rPr>
@@ -295,7 +293,7 @@
         </w:tabs>
         <w:spacing w:line="0" w:lineRule="atLeast"/>
         <w:rPr>
-          <w:rFonts w:hint="eastAsia" w:ascii="宋体" w:hAnsi="宋体" w:eastAsia="宋体" w:cs="宋体"/>
+          <w:rFonts w:ascii="Times New Roman" w:hAnsi="Times New Roman" w:cs="Times New Roman"/>
           <w:b/>
           <w:sz w:val="10"/>
           <w:szCs w:val="2"/>
@@ -304,7 +302,7 @@
       </w:pPr>
       <w:r>
         <w:rPr>
-          <w:rFonts w:hint="eastAsia" w:ascii="宋体" w:hAnsi="宋体" w:cs="宋体"/>
+          <w:rFonts w:ascii="Times New Roman" w:hAnsi="Times New Roman" w:cs="Times New Roman"/>
           <w:b/>
           <w:sz w:val="13"/>
           <w:szCs w:val="6"/>
@@ -316,15 +314,15 @@
     <w:p>
       <w:pPr>
         <w:spacing w:line="324" w:lineRule="auto"/>
-        <w:ind w:left="0" w:leftChars="0" w:right="0" w:rightChars="0" w:firstLineChars="200"/>
-        <w:rPr>
-          <w:rFonts w:hint="eastAsia" w:ascii="Times New Roman" w:hAnsi="Times New Roman" w:cs="Times New Roman"/>
+        <w:ind w:left="0" w:leftChars="0" w:right="0" w:rightChars="0"/>
+        <w:rPr>
+          <w:rFonts w:ascii="Times New Roman" w:hAnsi="Times New Roman" w:cs="Times New Roman"/>
           <w:sz w:val="24"/>
         </w:rPr>
       </w:pPr>
       <w:r>
         <w:rPr>
-          <w:rFonts w:hint="eastAsia" w:ascii="Times New Roman" w:hAnsi="Times New Roman" w:cs="Times New Roman"/>
+          <w:rFonts w:ascii="Times New Roman" w:hAnsi="Times New Roman" w:cs="Times New Roman"/>
           <w:sz w:val="24"/>
         </w:rPr>
         <w:t>Approx. 22% solids aqueous dispersion.</w:t>
@@ -334,14 +332,14 @@
       <w:pPr>
         <w:spacing w:line="0" w:lineRule="atLeast"/>
         <w:rPr>
-          <w:rFonts w:ascii="宋体" w:hAnsi="宋体" w:eastAsia="宋体" w:cs="Times New Roman"/>
+          <w:rFonts w:ascii="Times New Roman" w:hAnsi="Times New Roman" w:cs="Times New Roman"/>
           <w:b/>
           <w:sz w:val="28"/>
         </w:rPr>
       </w:pPr>
       <w:r>
         <w:rPr>
-          <w:rFonts w:ascii="宋体" w:hAnsi="宋体" w:eastAsia="宋体" w:cs="Times New Roman"/>
+          <w:rFonts w:ascii="Times New Roman" w:hAnsi="Times New Roman" w:cs="Times New Roman"/>
           <w:b/>
           <w:sz w:val="28"/>
         </w:rPr>
@@ -352,7 +350,7 @@
       <w:pPr>
         <w:spacing w:line="213" w:lineRule="exact"/>
         <w:rPr>
-          <w:rFonts w:ascii="Times New Roman" w:hAnsi="Times New Roman" w:eastAsia="Times New Roman" w:cs="Times New Roman"/>
+          <w:rFonts w:ascii="Times New Roman" w:hAnsi="Times New Roman" w:cs="Times New Roman"/>
           <w:sz w:val="13"/>
           <w:szCs w:val="8"/>
         </w:rPr>
@@ -407,7 +405,7 @@
               <w:spacing w:line="0" w:lineRule="atLeast"/>
               <w:jc w:val="center"/>
               <w:rPr>
-                <w:rFonts w:hint="eastAsia" w:ascii="宋体" w:hAnsi="宋体" w:eastAsia="宋体" w:cs="宋体"/>
+                <w:rFonts w:ascii="Times New Roman" w:hAnsi="Times New Roman" w:cs="Times New Roman"/>
                 <w:b/>
                 <w:bCs/>
                 <w:sz w:val="24"/>
@@ -415,7 +413,7 @@
             </w:pPr>
             <w:r>
               <w:rPr>
-                <w:rFonts w:hint="eastAsia" w:ascii="Times New Roman" w:hAnsi="Times New Roman"/>
+                <w:rFonts w:ascii="Times New Roman" w:hAnsi="Times New Roman" w:cs="Times New Roman"/>
                 <w:sz w:val="24"/>
               </w:rPr>
               <w:t>Item</w:t>
@@ -440,7 +438,7 @@
               <w:spacing w:line="0" w:lineRule="atLeast"/>
               <w:jc w:val="center"/>
               <w:rPr>
-                <w:rFonts w:cs="宋体"/>
+                <w:rFonts w:cs="Times New Roman" w:ascii="Times New Roman" w:hAnsi="Times New Roman"/>
                 <w:b/>
                 <w:bCs/>
                 <w:color w:val="000000"/>
@@ -451,7 +449,7 @@
             </w:pPr>
             <w:r>
               <w:rPr>
-                <w:rFonts w:hint="eastAsia" w:ascii="Times New Roman" w:hAnsi="Times New Roman"/>
+                <w:rFonts w:ascii="Times New Roman" w:hAnsi="Times New Roman" w:cs="Times New Roman"/>
                 <w:sz w:val="24"/>
               </w:rPr>
               <w:t>Index</w:t>
@@ -476,7 +474,7 @@
               <w:spacing w:line="0" w:lineRule="atLeast"/>
               <w:jc w:val="center"/>
               <w:rPr>
-                <w:rFonts w:hint="eastAsia" w:cs="宋体"/>
+                <w:rFonts w:cs="Times New Roman" w:ascii="Times New Roman" w:hAnsi="Times New Roman"/>
                 <w:b/>
                 <w:bCs/>
                 <w:color w:val="000000"/>
@@ -487,7 +485,7 @@
             </w:pPr>
             <w:r>
               <w:rPr>
-                <w:rFonts w:hint="eastAsia" w:ascii="Times New Roman" w:hAnsi="Times New Roman"/>
+                <w:rFonts w:ascii="Times New Roman" w:hAnsi="Times New Roman" w:cs="Times New Roman"/>
                 <w:sz w:val="24"/>
               </w:rPr>
               <w:t>Unit</w:t>
@@ -512,7 +510,7 @@
               <w:spacing w:line="0" w:lineRule="atLeast"/>
               <w:jc w:val="center"/>
               <w:rPr>
-                <w:rFonts w:hint="eastAsia" w:cs="宋体"/>
+                <w:rFonts w:cs="Times New Roman" w:ascii="Times New Roman" w:hAnsi="Times New Roman"/>
                 <w:b/>
                 <w:bCs/>
                 <w:color w:val="000000"/>
@@ -523,21 +521,21 @@
             </w:pPr>
             <w:r>
               <w:rPr>
-                <w:rFonts w:hint="eastAsia" w:ascii="Times New Roman" w:hAnsi="Times New Roman"/>
+                <w:rFonts w:ascii="Times New Roman" w:hAnsi="Times New Roman" w:cs="Times New Roman"/>
                 <w:sz w:val="24"/>
               </w:rPr>
               <w:t>Test</w:t>
             </w:r>
             <w:r>
               <w:rPr>
-                <w:rFonts w:ascii="Times New Roman" w:hAnsi="Times New Roman"/>
+                <w:rFonts w:ascii="Times New Roman" w:hAnsi="Times New Roman" w:cs="Times New Roman"/>
                 <w:sz w:val="24"/>
               </w:rPr>
               <w:t xml:space="preserve"> </w:t>
             </w:r>
             <w:r>
               <w:rPr>
-                <w:rFonts w:hint="eastAsia" w:ascii="Times New Roman" w:hAnsi="Times New Roman"/>
+                <w:rFonts w:ascii="Times New Roman" w:hAnsi="Times New Roman" w:cs="Times New Roman"/>
                 <w:sz w:val="24"/>
               </w:rPr>
               <w:t>method</w:t>
@@ -574,7 +572,7 @@
               <w:spacing w:line="0" w:lineRule="atLeast"/>
               <w:jc w:val="center"/>
               <w:rPr>
-                <w:rFonts w:ascii="Times New Roman" w:hAnsi="Times New Roman" w:eastAsia="Times New Roman" w:cs="Times New Roman"/>
+                <w:rFonts w:ascii="Times New Roman" w:hAnsi="Times New Roman" w:cs="Times New Roman"/>
                 <w:b w:val="0"/>
                 <w:bCs w:val="0"/>
                 <w:sz w:val="24"/>
@@ -582,7 +580,7 @@
             </w:pPr>
             <w:r>
               <w:rPr>
-                <w:rFonts w:hint="eastAsia" w:ascii="Times New Roman" w:hAnsi="Times New Roman"/>
+                <w:rFonts w:ascii="Times New Roman" w:hAnsi="Times New Roman" w:cs="Times New Roman"/>
                 <w:sz w:val="24"/>
               </w:rPr>
               <w:t>Appearance</w:t>
@@ -606,7 +604,7 @@
               <w:spacing w:line="0" w:lineRule="atLeast"/>
               <w:jc w:val="center"/>
               <w:rPr>
-                <w:rFonts w:hint="eastAsia" w:ascii="Times New Roman" w:hAnsi="Times New Roman" w:cs="Times New Roman"/>
+                <w:rFonts w:ascii="Times New Roman" w:hAnsi="Times New Roman" w:cs="Times New Roman"/>
                 <w:b w:val="0"/>
                 <w:bCs w:val="0"/>
                 <w:sz w:val="24"/>
@@ -614,24 +612,10 @@
             </w:pPr>
             <w:r>
               <w:rPr>
-                <w:rFonts w:ascii="Times New Roman" w:hAnsi="Times New Roman"/>
-                <w:sz w:val="24"/>
-              </w:rPr>
-              <w:t xml:space="preserve">Colorless to </w:t>
-            </w:r>
-            <w:r>
-              <w:rPr>
-                <w:rFonts w:hint="eastAsia" w:ascii="Times New Roman" w:hAnsi="Times New Roman"/>
-                <w:sz w:val="24"/>
-              </w:rPr>
-              <w:t>pale-</w:t>
-            </w:r>
-            <w:r>
-              <w:rPr>
-                <w:rFonts w:ascii="Times New Roman" w:hAnsi="Times New Roman"/>
-                <w:sz w:val="24"/>
-              </w:rPr>
-              <w:t>yellow transparent viscous liquid</w:t>
+                <w:rFonts w:ascii="Times New Roman" w:hAnsi="Times New Roman" w:cs="Times New Roman"/>
+                <w:sz w:val="24"/>
+              </w:rPr>
+              <w:t>Translucent liquid with blue light</w:t>
             </w:r>
           </w:p>
         </w:tc>
@@ -652,7 +636,7 @@
               <w:spacing w:line="0" w:lineRule="atLeast"/>
               <w:jc w:val="center"/>
               <w:rPr>
-                <w:rFonts w:hint="eastAsia" w:ascii="Times New Roman" w:hAnsi="Times New Roman" w:cs="Times New Roman"/>
+                <w:rFonts w:ascii="Times New Roman" w:hAnsi="Times New Roman" w:cs="Times New Roman"/>
                 <w:b w:val="0"/>
                 <w:bCs w:val="0"/>
                 <w:sz w:val="24"/>
@@ -677,7 +661,7 @@
               <w:spacing w:line="0" w:lineRule="atLeast"/>
               <w:jc w:val="center"/>
               <w:rPr>
-                <w:rFonts w:hint="eastAsia" w:ascii="Times New Roman" w:hAnsi="Times New Roman" w:cs="Times New Roman"/>
+                <w:rFonts w:ascii="Times New Roman" w:hAnsi="Times New Roman" w:cs="Times New Roman"/>
                 <w:b w:val="0"/>
                 <w:bCs w:val="0"/>
                 <w:sz w:val="24"/>
@@ -685,10 +669,10 @@
             </w:pPr>
             <w:r>
               <w:rPr>
-                <w:rFonts w:ascii="Times New Roman" w:hAnsi="Times New Roman"/>
-                <w:sz w:val="24"/>
-              </w:rPr>
-              <w:t>Visual inspection</w:t>
+                <w:rFonts w:ascii="Times New Roman" w:hAnsi="Times New Roman" w:cs="Times New Roman"/>
+                <w:sz w:val="24"/>
+              </w:rPr>
+              <w:t>Visual</w:t>
             </w:r>
           </w:p>
         </w:tc>
@@ -722,7 +706,7 @@
               <w:spacing w:line="0" w:lineRule="atLeast"/>
               <w:jc w:val="center"/>
               <w:rPr>
-                <w:rFonts w:ascii="Times New Roman" w:hAnsi="Times New Roman" w:eastAsia="Times New Roman" w:cs="Times New Roman"/>
+                <w:rFonts w:ascii="Times New Roman" w:hAnsi="Times New Roman" w:cs="Times New Roman"/>
                 <w:b w:val="0"/>
                 <w:bCs w:val="0"/>
                 <w:sz w:val="24"/>
@@ -730,17 +714,10 @@
             </w:pPr>
             <w:r>
               <w:rPr>
-                <w:rFonts w:hint="eastAsia" w:ascii="Times New Roman" w:hAnsi="Times New Roman"/>
-                <w:sz w:val="24"/>
-              </w:rPr>
-              <w:t>S</w:t>
-            </w:r>
-            <w:r>
-              <w:rPr>
-                <w:rFonts w:ascii="Times New Roman" w:hAnsi="Times New Roman"/>
-                <w:sz w:val="24"/>
-              </w:rPr>
-              <w:t>olid content</w:t>
+                <w:rFonts w:ascii="Times New Roman" w:hAnsi="Times New Roman" w:cs="Times New Roman"/>
+                <w:sz w:val="24"/>
+              </w:rPr>
+              <w:t>Solid content</w:t>
             </w:r>
           </w:p>
         </w:tc>
@@ -761,7 +738,7 @@
               <w:spacing w:line="0" w:lineRule="atLeast"/>
               <w:jc w:val="center"/>
               <w:rPr>
-                <w:rFonts w:hint="eastAsia" w:ascii="Times New Roman" w:hAnsi="Times New Roman" w:cs="Times New Roman"/>
+                <w:rFonts w:ascii="Times New Roman" w:hAnsi="Times New Roman" w:cs="Times New Roman"/>
                 <w:b w:val="0"/>
                 <w:bCs w:val="0"/>
                 <w:sz w:val="24"/>
@@ -769,24 +746,10 @@
             </w:pPr>
             <w:r>
               <w:rPr>
-                <w:rFonts w:ascii="Times New Roman" w:hAnsi="Times New Roman"/>
-                <w:sz w:val="24"/>
-              </w:rPr>
-              <w:t>70</w:t>
-            </w:r>
-            <w:r>
-              <w:rPr>
-                <w:rFonts w:hint="eastAsia" w:ascii="Times New Roman" w:hAnsi="Times New Roman"/>
-                <w:sz w:val="24"/>
-              </w:rPr>
-              <w:t>±</w:t>
-            </w:r>
-            <w:r>
-              <w:rPr>
-                <w:rFonts w:ascii="Times New Roman" w:hAnsi="Times New Roman"/>
-                <w:sz w:val="24"/>
-              </w:rPr>
-              <w:t>2</w:t>
+                <w:rFonts w:ascii="Times New Roman" w:hAnsi="Times New Roman" w:cs="Times New Roman"/>
+                <w:sz w:val="24"/>
+              </w:rPr>
+              <w:t>22±1</w:t>
             </w:r>
           </w:p>
         </w:tc>
@@ -807,7 +770,7 @@
               <w:spacing w:line="0" w:lineRule="atLeast"/>
               <w:jc w:val="center"/>
               <w:rPr>
-                <w:rFonts w:hint="eastAsia" w:ascii="Times New Roman" w:hAnsi="Times New Roman" w:cs="Times New Roman"/>
+                <w:rFonts w:ascii="Times New Roman" w:hAnsi="Times New Roman" w:cs="Times New Roman"/>
                 <w:b w:val="0"/>
                 <w:bCs w:val="0"/>
                 <w:sz w:val="24"/>
@@ -815,7 +778,7 @@
             </w:pPr>
             <w:r>
               <w:rPr>
-                <w:rFonts w:hint="eastAsia" w:ascii="Times New Roman" w:hAnsi="Times New Roman"/>
+                <w:rFonts w:ascii="Times New Roman" w:hAnsi="Times New Roman" w:cs="Times New Roman"/>
                 <w:sz w:val="24"/>
               </w:rPr>
               <w:t>%</w:t>
@@ -839,7 +802,7 @@
               <w:spacing w:line="0" w:lineRule="atLeast"/>
               <w:jc w:val="center"/>
               <w:rPr>
-                <w:rFonts w:hint="eastAsia" w:ascii="Times New Roman" w:hAnsi="Times New Roman" w:cs="Times New Roman"/>
+                <w:rFonts w:ascii="Times New Roman" w:hAnsi="Times New Roman" w:cs="Times New Roman"/>
                 <w:b w:val="0"/>
                 <w:bCs w:val="0"/>
                 <w:sz w:val="24"/>
@@ -847,45 +810,10 @@
             </w:pPr>
             <w:r>
               <w:rPr>
-                <w:rFonts w:hint="eastAsia" w:ascii="Times New Roman" w:hAnsi="Times New Roman"/>
-                <w:sz w:val="24"/>
-              </w:rPr>
-              <w:t>1</w:t>
-            </w:r>
-            <w:r>
-              <w:rPr>
-                <w:rFonts w:ascii="Times New Roman" w:hAnsi="Times New Roman"/>
-                <w:sz w:val="24"/>
-              </w:rPr>
-              <w:t>50</w:t>
-            </w:r>
-            <w:r>
-              <w:rPr>
-                <w:rFonts w:hint="eastAsia" w:ascii="Times New Roman" w:hAnsi="Times New Roman"/>
-                <w:sz w:val="24"/>
-              </w:rPr>
-              <w:t>℃</w:t>
-            </w:r>
-            <w:r>
-              <w:rPr>
-                <w:rFonts w:ascii="Times New Roman" w:hAnsi="Times New Roman"/>
-                <w:sz w:val="24"/>
-              </w:rPr>
-              <w:t xml:space="preserve"> 30</w:t>
-            </w:r>
-            <w:r>
-              <w:rPr>
-                <w:rFonts w:hint="eastAsia" w:ascii="Times New Roman" w:hAnsi="Times New Roman"/>
-                <w:sz w:val="24"/>
-              </w:rPr>
-              <w:t>min,</w:t>
-            </w:r>
-            <w:r>
-              <w:rPr>
-                <w:rFonts w:ascii="Times New Roman" w:hAnsi="Times New Roman"/>
-                <w:sz w:val="24"/>
-              </w:rPr>
-              <w:t xml:space="preserve"> convection oven</w:t>
+                <w:rFonts w:ascii="Times New Roman" w:hAnsi="Times New Roman" w:cs="Times New Roman"/>
+                <w:sz w:val="24"/>
+              </w:rPr>
+              <w:t>150°C, 30 min, forced-air oven</w:t>
             </w:r>
           </w:p>
         </w:tc>
@@ -919,7 +847,7 @@
               <w:spacing w:line="0" w:lineRule="atLeast"/>
               <w:jc w:val="center"/>
               <w:rPr>
-                <w:rFonts w:ascii="宋体" w:hAnsi="宋体" w:cs="宋体"/>
+                <w:rFonts w:ascii="Times New Roman" w:hAnsi="Times New Roman" w:cs="Times New Roman"/>
                 <w:b w:val="0"/>
                 <w:bCs w:val="0"/>
                 <w:sz w:val="24"/>
@@ -927,24 +855,10 @@
             </w:pPr>
             <w:r>
               <w:rPr>
-                <w:rFonts w:ascii="Times New Roman" w:hAnsi="Times New Roman"/>
-                <w:sz w:val="24"/>
-              </w:rPr>
-              <w:t xml:space="preserve">NCO </w:t>
-            </w:r>
-            <w:r>
-              <w:rPr>
-                <w:rFonts w:hint="eastAsia" w:ascii="Times New Roman" w:hAnsi="Times New Roman"/>
-                <w:sz w:val="24"/>
-              </w:rPr>
-              <w:t>v</w:t>
-            </w:r>
-            <w:r>
-              <w:rPr>
-                <w:rFonts w:ascii="Times New Roman" w:hAnsi="Times New Roman"/>
-                <w:sz w:val="24"/>
-              </w:rPr>
-              <w:t>alue (on supplied)</w:t>
+                <w:rFonts w:ascii="Times New Roman" w:hAnsi="Times New Roman" w:cs="Times New Roman"/>
+                <w:sz w:val="24"/>
+              </w:rPr>
+              <w:t>Viscosity (25°C)</w:t>
             </w:r>
           </w:p>
         </w:tc>
@@ -965,7 +879,7 @@
               <w:spacing w:line="0" w:lineRule="atLeast"/>
               <w:jc w:val="center"/>
               <w:rPr>
-                <w:rFonts w:hint="eastAsia" w:ascii="Times New Roman" w:hAnsi="Times New Roman" w:cs="Times New Roman"/>
+                <w:rFonts w:ascii="Times New Roman" w:hAnsi="Times New Roman" w:cs="Times New Roman"/>
                 <w:b w:val="0"/>
                 <w:bCs w:val="0"/>
                 <w:sz w:val="24"/>
@@ -973,25 +887,10 @@
             </w:pPr>
             <w:r>
               <w:rPr>
-                <w:rFonts w:ascii="Times New Roman" w:hAnsi="Times New Roman"/>
-                <w:sz w:val="24"/>
-              </w:rPr>
-              <w:t>9.</w:t>
-            </w:r>
-            <w:r>
-              <w:rPr>
-                <w:rFonts w:hint="eastAsia" w:ascii="Times New Roman" w:hAnsi="Times New Roman"/>
-                <w:sz w:val="24"/>
-                <w:lang w:val="en-US" w:eastAsia="zh-CN"/>
-              </w:rPr>
-              <w:t>3</w:t>
-            </w:r>
-            <w:r>
-              <w:rPr>
-                <w:rFonts w:ascii="Times New Roman" w:hAnsi="Times New Roman"/>
-                <w:sz w:val="24"/>
-              </w:rPr>
-              <w:t>±0.5</w:t>
+                <w:rFonts w:ascii="Times New Roman" w:hAnsi="Times New Roman" w:cs="Times New Roman"/>
+                <w:sz w:val="24"/>
+              </w:rPr>
+              <w:t>&lt;500</w:t>
             </w:r>
           </w:p>
         </w:tc>
@@ -1012,7 +911,7 @@
               <w:spacing w:line="0" w:lineRule="atLeast"/>
               <w:jc w:val="center"/>
               <w:rPr>
-                <w:rFonts w:hint="eastAsia" w:ascii="Times New Roman" w:hAnsi="Times New Roman" w:cs="Times New Roman"/>
+                <w:rFonts w:ascii="Times New Roman" w:hAnsi="Times New Roman" w:cs="Times New Roman"/>
                 <w:b w:val="0"/>
                 <w:bCs w:val="0"/>
                 <w:sz w:val="24"/>
@@ -1020,10 +919,10 @@
             </w:pPr>
             <w:r>
               <w:rPr>
-                <w:rFonts w:hint="eastAsia" w:ascii="Times New Roman" w:hAnsi="Times New Roman"/>
-                <w:sz w:val="24"/>
-              </w:rPr>
-              <w:t>%</w:t>
+                <w:rFonts w:ascii="Times New Roman" w:hAnsi="Times New Roman" w:cs="Times New Roman"/>
+                <w:sz w:val="24"/>
+              </w:rPr>
+              <w:t>mPa·s</w:t>
             </w:r>
           </w:p>
         </w:tc>
@@ -1044,7 +943,7 @@
               <w:spacing w:line="0" w:lineRule="atLeast"/>
               <w:jc w:val="center"/>
               <w:rPr>
-                <w:rFonts w:hint="eastAsia" w:ascii="Times New Roman" w:hAnsi="Times New Roman" w:cs="Times New Roman"/>
+                <w:rFonts w:ascii="Times New Roman" w:hAnsi="Times New Roman" w:cs="Times New Roman"/>
                 <w:b w:val="0"/>
                 <w:bCs w:val="0"/>
                 <w:sz w:val="24"/>
@@ -1052,17 +951,10 @@
             </w:pPr>
             <w:r>
               <w:rPr>
-                <w:rFonts w:hint="eastAsia" w:ascii="Times New Roman" w:hAnsi="Times New Roman"/>
-                <w:sz w:val="24"/>
-              </w:rPr>
-              <w:t>GB</w:t>
-            </w:r>
-            <w:r>
-              <w:rPr>
-                <w:rFonts w:ascii="Times New Roman" w:hAnsi="Times New Roman"/>
-                <w:sz w:val="24"/>
-              </w:rPr>
-              <w:t>/T 12009.5-1992</w:t>
+                <w:rFonts w:ascii="Times New Roman" w:hAnsi="Times New Roman" w:cs="Times New Roman"/>
+                <w:sz w:val="24"/>
+              </w:rPr>
+              <w:t>GB/T 2794-2022</w:t>
             </w:r>
           </w:p>
         </w:tc>
@@ -1096,7 +988,7 @@
               <w:spacing w:line="0" w:lineRule="atLeast"/>
               <w:jc w:val="center"/>
               <w:rPr>
-                <w:rFonts w:ascii="宋体" w:hAnsi="宋体" w:cs="宋体"/>
+                <w:rFonts w:ascii="Times New Roman" w:hAnsi="Times New Roman" w:cs="Times New Roman"/>
                 <w:b w:val="0"/>
                 <w:bCs w:val="0"/>
                 <w:sz w:val="24"/>
@@ -1104,31 +996,10 @@
             </w:pPr>
             <w:r>
               <w:rPr>
-                <w:rFonts w:hint="eastAsia" w:ascii="Times New Roman" w:hAnsi="Times New Roman"/>
-                <w:sz w:val="24"/>
-              </w:rPr>
-              <w:t>V</w:t>
-            </w:r>
-            <w:r>
-              <w:rPr>
-                <w:rFonts w:ascii="Times New Roman" w:hAnsi="Times New Roman"/>
-                <w:sz w:val="24"/>
-              </w:rPr>
-              <w:t>iscosity (25</w:t>
-            </w:r>
-            <w:r>
-              <w:rPr>
-                <w:rFonts w:hint="eastAsia" w:ascii="Times New Roman" w:hAnsi="Times New Roman"/>
-                <w:sz w:val="24"/>
-              </w:rPr>
-              <w:t>℃</w:t>
-            </w:r>
-            <w:r>
-              <w:rPr>
-                <w:rFonts w:ascii="Times New Roman" w:hAnsi="Times New Roman"/>
-                <w:sz w:val="24"/>
-              </w:rPr>
-              <w:t>)</w:t>
+                <w:rFonts w:ascii="Times New Roman" w:hAnsi="Times New Roman" w:cs="Times New Roman"/>
+                <w:sz w:val="24"/>
+              </w:rPr>
+              <w:t>pH value (diluted 1:10 in water)</w:t>
             </w:r>
           </w:p>
         </w:tc>
@@ -1149,7 +1020,7 @@
               <w:spacing w:line="0" w:lineRule="atLeast"/>
               <w:jc w:val="center"/>
               <w:rPr>
-                <w:rFonts w:ascii="宋体" w:hAnsi="宋体" w:cs="宋体"/>
+                <w:rFonts w:ascii="Times New Roman" w:hAnsi="Times New Roman" w:cs="Times New Roman"/>
                 <w:b w:val="0"/>
                 <w:bCs w:val="0"/>
                 <w:sz w:val="24"/>
@@ -1157,32 +1028,10 @@
             </w:pPr>
             <w:r>
               <w:rPr>
-                <w:rFonts w:hint="eastAsia" w:ascii="Times New Roman" w:hAnsi="Times New Roman"/>
-                <w:sz w:val="24"/>
-                <w:lang w:val="en-US" w:eastAsia="zh-CN"/>
-              </w:rPr>
-              <w:t>10</w:t>
-            </w:r>
-            <w:r>
-              <w:rPr>
-                <w:rFonts w:ascii="Times New Roman" w:hAnsi="Times New Roman"/>
-                <w:sz w:val="24"/>
-              </w:rPr>
-              <w:t>00</w:t>
-            </w:r>
-            <w:r>
-              <w:rPr>
-                <w:rFonts w:hint="eastAsia" w:ascii="Times New Roman" w:hAnsi="Times New Roman"/>
-                <w:sz w:val="24"/>
-              </w:rPr>
-              <w:t>±</w:t>
-            </w:r>
-            <w:r>
-              <w:rPr>
-                <w:rFonts w:ascii="Times New Roman" w:hAnsi="Times New Roman"/>
-                <w:sz w:val="24"/>
-              </w:rPr>
-              <w:t>500</w:t>
+                <w:rFonts w:ascii="Times New Roman" w:hAnsi="Times New Roman" w:cs="Times New Roman"/>
+                <w:sz w:val="24"/>
+              </w:rPr>
+              <w:t>7.0-9.0</w:t>
             </w:r>
           </w:p>
         </w:tc>
@@ -1203,19 +1052,12 @@
               <w:spacing w:line="0" w:lineRule="atLeast"/>
               <w:jc w:val="center"/>
               <w:rPr>
-                <w:rFonts w:hint="eastAsia" w:ascii="宋体" w:hAnsi="宋体" w:cs="宋体"/>
+                <w:rFonts w:ascii="Times New Roman" w:hAnsi="Times New Roman" w:cs="Times New Roman"/>
                 <w:b w:val="0"/>
                 <w:bCs w:val="0"/>
                 <w:sz w:val="24"/>
               </w:rPr>
             </w:pPr>
-            <w:r>
-              <w:rPr>
-                <w:rFonts w:ascii="Times New Roman" w:hAnsi="Times New Roman"/>
-                <w:sz w:val="24"/>
-              </w:rPr>
-              <w:t>mPa·S</w:t>
-            </w:r>
           </w:p>
         </w:tc>
         <w:tc>
@@ -1235,7 +1077,7 @@
               <w:spacing w:line="0" w:lineRule="atLeast"/>
               <w:jc w:val="center"/>
               <w:rPr>
-                <w:rFonts w:hint="eastAsia" w:ascii="宋体" w:hAnsi="宋体" w:cs="宋体"/>
+                <w:rFonts w:ascii="Times New Roman" w:hAnsi="Times New Roman" w:cs="Times New Roman"/>
                 <w:b w:val="0"/>
                 <w:bCs w:val="0"/>
                 <w:sz w:val="24"/>
@@ -1243,10 +1085,10 @@
             </w:pPr>
             <w:r>
               <w:rPr>
-                <w:rFonts w:ascii="Times New Roman" w:hAnsi="Times New Roman"/>
-                <w:sz w:val="24"/>
-              </w:rPr>
-              <w:t>GB/T 2794-2013</w:t>
+                <w:rFonts w:ascii="Times New Roman" w:hAnsi="Times New Roman" w:cs="Times New Roman"/>
+                <w:sz w:val="24"/>
+              </w:rPr>
+              <w:t>GB 6920-86</w:t>
             </w:r>
           </w:p>
         </w:tc>
@@ -1280,7 +1122,7 @@
               <w:spacing w:line="0" w:lineRule="atLeast"/>
               <w:jc w:val="center"/>
               <w:rPr>
-                <w:rFonts w:hint="eastAsia" w:ascii="宋体" w:hAnsi="宋体" w:cs="宋体"/>
+                <w:rFonts w:ascii="Times New Roman" w:hAnsi="Times New Roman" w:cs="Times New Roman"/>
                 <w:b w:val="0"/>
                 <w:bCs w:val="0"/>
                 <w:sz w:val="24"/>
@@ -1288,17 +1130,10 @@
             </w:pPr>
             <w:r>
               <w:rPr>
-                <w:rFonts w:hint="eastAsia" w:ascii="Times New Roman" w:hAnsi="Times New Roman"/>
-                <w:sz w:val="24"/>
-              </w:rPr>
-              <w:t>IP</w:t>
-            </w:r>
-            <w:r>
-              <w:rPr>
-                <w:rFonts w:ascii="Times New Roman" w:hAnsi="Times New Roman"/>
-                <w:sz w:val="24"/>
-              </w:rPr>
-              <w:t>DI monomer</w:t>
+                <w:rFonts w:ascii="Times New Roman" w:hAnsi="Times New Roman" w:cs="Times New Roman"/>
+                <w:sz w:val="24"/>
+              </w:rPr>
+              <w:t>Density (25°C)</w:t>
             </w:r>
           </w:p>
         </w:tc>
@@ -1319,7 +1154,7 @@
               <w:spacing w:line="0" w:lineRule="atLeast"/>
               <w:jc w:val="center"/>
               <w:rPr>
-                <w:rFonts w:hint="eastAsia" w:ascii="宋体" w:hAnsi="宋体" w:cs="宋体"/>
+                <w:rFonts w:ascii="Times New Roman" w:hAnsi="Times New Roman" w:cs="Times New Roman"/>
                 <w:b w:val="0"/>
                 <w:bCs w:val="0"/>
                 <w:sz w:val="24"/>
@@ -1327,10 +1162,10 @@
             </w:pPr>
             <w:r>
               <w:rPr>
-                <w:rFonts w:ascii="Times New Roman" w:hAnsi="Times New Roman"/>
-                <w:sz w:val="24"/>
-              </w:rPr>
-              <w:t>&lt;0.35</w:t>
+                <w:rFonts w:ascii="Times New Roman" w:hAnsi="Times New Roman" w:cs="Times New Roman"/>
+                <w:sz w:val="24"/>
+              </w:rPr>
+              <w:t>Approx. 1.06</w:t>
             </w:r>
           </w:p>
         </w:tc>
@@ -1351,7 +1186,7 @@
               <w:spacing w:line="0" w:lineRule="atLeast"/>
               <w:jc w:val="center"/>
               <w:rPr>
-                <w:rFonts w:hint="eastAsia" w:ascii="宋体" w:hAnsi="宋体" w:cs="宋体"/>
+                <w:rFonts w:ascii="Times New Roman" w:hAnsi="Times New Roman" w:cs="Times New Roman"/>
                 <w:b w:val="0"/>
                 <w:bCs w:val="0"/>
                 <w:sz w:val="24"/>
@@ -1359,10 +1194,10 @@
             </w:pPr>
             <w:r>
               <w:rPr>
-                <w:rFonts w:ascii="Times New Roman" w:hAnsi="Times New Roman"/>
-                <w:sz w:val="24"/>
-              </w:rPr>
-              <w:t>%</w:t>
+                <w:rFonts w:ascii="Times New Roman" w:hAnsi="Times New Roman" w:cs="Times New Roman"/>
+                <w:sz w:val="24"/>
+              </w:rPr>
+              <w:t>g/cm³</w:t>
             </w:r>
           </w:p>
         </w:tc>
@@ -1383,7 +1218,7 @@
               <w:spacing w:line="0" w:lineRule="atLeast"/>
               <w:jc w:val="center"/>
               <w:rPr>
-                <w:rFonts w:hint="eastAsia" w:ascii="宋体" w:hAnsi="宋体" w:cs="宋体"/>
+                <w:rFonts w:ascii="Times New Roman" w:hAnsi="Times New Roman" w:cs="Times New Roman"/>
                 <w:b w:val="0"/>
                 <w:bCs w:val="0"/>
                 <w:sz w:val="24"/>
@@ -1391,10 +1226,10 @@
             </w:pPr>
             <w:r>
               <w:rPr>
-                <w:rFonts w:ascii="Times New Roman" w:hAnsi="Times New Roman"/>
-                <w:sz w:val="24"/>
-              </w:rPr>
-              <w:t>GB/T 18446-2009</w:t>
+                <w:rFonts w:ascii="Times New Roman" w:hAnsi="Times New Roman" w:cs="Times New Roman"/>
+                <w:sz w:val="24"/>
+              </w:rPr>
+              <w:t>GB/T 4472-2011</w:t>
             </w:r>
           </w:p>
         </w:tc>
@@ -1404,7 +1239,7 @@
       <w:pPr>
         <w:spacing w:line="207" w:lineRule="exact"/>
         <w:rPr>
-          <w:rFonts w:hint="eastAsia" w:ascii="Times New Roman" w:hAnsi="Times New Roman" w:eastAsia="宋体" w:cs="Times New Roman"/>
+          <w:rFonts w:ascii="Times New Roman" w:hAnsi="Times New Roman" w:cs="Times New Roman"/>
           <w:sz w:val="16"/>
           <w:szCs w:val="11"/>
         </w:rPr>
@@ -1414,14 +1249,14 @@
       <w:pPr>
         <w:spacing w:line="0" w:lineRule="atLeast"/>
         <w:rPr>
-          <w:rFonts w:ascii="宋体" w:hAnsi="宋体" w:eastAsia="宋体" w:cs="Times New Roman"/>
+          <w:rFonts w:ascii="Times New Roman" w:hAnsi="Times New Roman" w:cs="Times New Roman"/>
           <w:b/>
           <w:sz w:val="28"/>
         </w:rPr>
       </w:pPr>
       <w:r>
         <w:rPr>
-          <w:rFonts w:ascii="宋体" w:hAnsi="宋体" w:eastAsia="宋体" w:cs="Times New Roman"/>
+          <w:rFonts w:ascii="Times New Roman" w:hAnsi="Times New Roman" w:cs="Times New Roman"/>
           <w:b/>
           <w:sz w:val="28"/>
         </w:rPr>
@@ -1432,10 +1267,10 @@
       <w:pPr>
         <w:spacing w:line="0" w:lineRule="atLeast"/>
         <w:rPr>
-          <w:rFonts w:ascii="宋体" w:hAnsi="宋体" w:eastAsia="宋体" w:cs="Times New Roman"/>
-          <w:b/>
-          <w:sz w:val="15"/>
-          <w:szCs w:val="8"/>
+          <w:rFonts w:ascii="Times New Roman" w:hAnsi="Times New Roman" w:cs="Times New Roman"/>
+          <w:b/>
+          <w:sz w:val="8"/>
+          <w:szCs w:val="2"/>
         </w:rPr>
       </w:pPr>
     </w:p>
@@ -1446,15 +1281,15 @@
           <w:numId w:val="1"/>
         </w:numPr>
         <w:spacing w:line="324" w:lineRule="auto"/>
-        <w:ind w:left="0" w:leftChars="0" w:right="0" w:rightChars="0" w:firstLineChars="200"/>
-        <w:rPr>
-          <w:rFonts w:hint="eastAsia" w:ascii="Times New Roman" w:hAnsi="Times New Roman" w:cs="Times New Roman"/>
+        <w:ind w:left="0" w:leftChars="0" w:right="0" w:rightChars="0"/>
+        <w:rPr>
+          <w:rFonts w:ascii="Times New Roman" w:hAnsi="Times New Roman" w:cs="Times New Roman"/>
           <w:sz w:val="24"/>
         </w:rPr>
       </w:pPr>
       <w:r>
         <w:rPr>
-          <w:rFonts w:hint="eastAsia" w:ascii="Times New Roman" w:hAnsi="Times New Roman" w:cs="Times New Roman"/>
+          <w:rFonts w:ascii="Times New Roman" w:hAnsi="Times New Roman" w:cs="Times New Roman"/>
           <w:sz w:val="24"/>
         </w:rPr>
         <w:t>Very soft film formation;</w:t>
@@ -1467,15 +1302,15 @@
           <w:numId w:val="1"/>
         </w:numPr>
         <w:spacing w:line="324" w:lineRule="auto"/>
-        <w:ind w:left="0" w:leftChars="0" w:right="0" w:rightChars="0" w:firstLineChars="200"/>
-        <w:rPr>
-          <w:rFonts w:hint="eastAsia" w:ascii="Times New Roman" w:hAnsi="Times New Roman" w:cs="Times New Roman"/>
+        <w:ind w:left="0" w:leftChars="0" w:right="0" w:rightChars="0"/>
+        <w:rPr>
+          <w:rFonts w:ascii="Times New Roman" w:hAnsi="Times New Roman" w:cs="Times New Roman"/>
           <w:sz w:val="24"/>
         </w:rPr>
       </w:pPr>
       <w:r>
         <w:rPr>
-          <w:rFonts w:hint="eastAsia" w:ascii="Times New Roman" w:hAnsi="Times New Roman" w:cs="Times New Roman"/>
+          <w:rFonts w:ascii="Times New Roman" w:hAnsi="Times New Roman" w:cs="Times New Roman"/>
           <w:sz w:val="24"/>
         </w:rPr>
         <w:t>Excellent adhesion;</w:t>
@@ -1483,58 +1318,16 @@
     </w:p>
     <w:p>
       <w:pPr>
-        <w:numPr>
-          <w:ilvl w:val="0"/>
-          <w:numId w:val="1"/>
-        </w:numPr>
-        <w:spacing w:line="324" w:lineRule="auto"/>
-        <w:ind w:left="0" w:leftChars="0" w:right="0" w:rightChars="0" w:firstLineChars="200"/>
-        <w:rPr>
-          <w:rFonts w:hint="eastAsia" w:ascii="Times New Roman" w:hAnsi="Times New Roman" w:cs="Times New Roman"/>
-          <w:sz w:val="24"/>
-        </w:rPr>
-      </w:pPr>
-      <w:r>
-        <w:rPr>
-          <w:rFonts w:hint="eastAsia" w:ascii="Times New Roman" w:hAnsi="Times New Roman" w:cs="Times New Roman"/>
-          <w:sz w:val="24"/>
-        </w:rPr>
-        <w:t>Good yellowing resistance;</w:t>
-      </w:r>
-    </w:p>
-    <w:p>
-      <w:pPr>
-        <w:numPr>
-          <w:ilvl w:val="0"/>
-          <w:numId w:val="1"/>
-        </w:numPr>
-        <w:spacing w:line="324" w:lineRule="auto"/>
-        <w:ind w:left="0" w:leftChars="0" w:right="0" w:rightChars="0" w:firstLineChars="200"/>
-        <w:rPr>
-          <w:rFonts w:hint="eastAsia" w:ascii="Times New Roman" w:hAnsi="Times New Roman" w:cs="Times New Roman"/>
-          <w:sz w:val="24"/>
-        </w:rPr>
-      </w:pPr>
-      <w:r>
-        <w:rPr>
-          <w:rFonts w:hint="eastAsia" w:ascii="Times New Roman" w:hAnsi="Times New Roman" w:cs="Times New Roman"/>
-          <w:sz w:val="24"/>
-        </w:rPr>
-        <w:t>Good penetration;</w:t>
-      </w:r>
-    </w:p>
-    <w:p>
-      <w:pPr>
         <w:spacing w:line="0" w:lineRule="atLeast"/>
         <w:rPr>
-          <w:rFonts w:ascii="宋体" w:hAnsi="宋体" w:eastAsia="宋体" w:cs="Times New Roman"/>
+          <w:rFonts w:ascii="Times New Roman" w:hAnsi="Times New Roman" w:cs="Times New Roman"/>
           <w:b/>
           <w:sz w:val="28"/>
         </w:rPr>
       </w:pPr>
       <w:r>
         <w:rPr>
-          <w:rFonts w:ascii="宋体" w:hAnsi="宋体" w:eastAsia="宋体" w:cs="Times New Roman"/>
+          <w:rFonts w:ascii="Times New Roman" w:hAnsi="Times New Roman" w:cs="Times New Roman"/>
           <w:b/>
           <w:sz w:val="28"/>
         </w:rPr>
@@ -1545,7 +1338,7 @@
       <w:pPr>
         <w:spacing w:line="0" w:lineRule="atLeast"/>
         <w:rPr>
-          <w:rFonts w:ascii="宋体" w:hAnsi="宋体" w:cs="宋体"/>
+          <w:rFonts w:ascii="Times New Roman" w:hAnsi="Times New Roman" w:cs="Times New Roman"/>
           <w:b/>
           <w:sz w:val="13"/>
           <w:szCs w:val="6"/>
@@ -1555,15 +1348,15 @@
     <w:p>
       <w:pPr>
         <w:spacing w:line="324" w:lineRule="auto"/>
-        <w:ind w:left="0" w:leftChars="0" w:right="0" w:rightChars="0" w:firstLineChars="200"/>
-        <w:rPr>
-          <w:rFonts w:ascii="宋体" w:hAnsi="宋体" w:cs="宋体"/>
+        <w:ind w:left="0" w:leftChars="0" w:right="0" w:rightChars="0"/>
+        <w:rPr>
+          <w:rFonts w:ascii="Times New Roman" w:hAnsi="Times New Roman" w:cs="Times New Roman"/>
           <w:sz w:val="24"/>
         </w:rPr>
       </w:pPr>
       <w:r>
         <w:rPr>
-          <w:rFonts w:hint="eastAsia" w:ascii="Times New Roman" w:hAnsi="Times New Roman" w:cs="Times New Roman"/>
+          <w:rFonts w:ascii="Times New Roman" w:hAnsi="Times New Roman" w:cs="Times New Roman"/>
           <w:sz w:val="24"/>
         </w:rPr>
         <w:t>PU-1001 forms a very soft film with strong adhesion, suitable for use alone as a tie coat or blended with other materials to improve interlayer adhesion and physical properties without increasing coating stiffness.</w:t>
@@ -1572,61 +1365,57 @@
     <w:p>
       <w:pPr>
         <w:spacing w:line="324" w:lineRule="auto"/>
-        <w:ind w:left="0" w:leftChars="0" w:right="0" w:rightChars="0" w:firstLineChars="200"/>
-        <w:rPr>
-          <w:rFonts w:hint="eastAsia" w:ascii="Times New Roman" w:hAnsi="Times New Roman" w:cs="Times New Roman"/>
+        <w:ind w:left="0" w:leftChars="0" w:right="0" w:rightChars="0"/>
+        <w:rPr>
+          <w:rFonts w:ascii="Times New Roman" w:hAnsi="Times New Roman" w:cs="Times New Roman"/>
+          <w:sz w:val="4"/>
+          <w:szCs w:val="2"/>
+        </w:rPr>
+      </w:pPr>
+    </w:p>
+    <w:p>
+      <w:pPr>
+        <w:spacing w:line="0" w:lineRule="atLeast"/>
+        <w:rPr>
+          <w:rFonts w:ascii="Times New Roman" w:hAnsi="Times New Roman" w:cs="Times New Roman"/>
+          <w:b/>
+          <w:sz w:val="28"/>
+        </w:rPr>
+      </w:pPr>
+      <w:r>
+        <w:rPr>
+          <w:rFonts w:ascii="Times New Roman" w:hAnsi="Times New Roman" w:cs="Times New Roman"/>
+          <w:b/>
+          <w:sz w:val="28"/>
+        </w:rPr>
+        <w:t>Storage</w:t>
+      </w:r>
+      <w:bookmarkStart w:id="1" w:name="_GoBack"/>
+      <w:bookmarkEnd w:id="1"/>
+    </w:p>
+    <w:p>
+      <w:pPr>
+        <w:spacing w:line="0" w:lineRule="atLeast"/>
+        <w:rPr>
+          <w:rFonts w:ascii="Times New Roman" w:hAnsi="Times New Roman" w:cs="Times New Roman"/>
+          <w:b/>
+          <w:sz w:val="8"/>
+          <w:szCs w:val="4"/>
+        </w:rPr>
+      </w:pPr>
+    </w:p>
+    <w:p>
+      <w:pPr>
+        <w:spacing w:line="324" w:lineRule="auto"/>
+        <w:ind w:left="0" w:leftChars="0" w:right="0" w:rightChars="0"/>
+        <w:rPr>
+          <w:rFonts w:ascii="Times New Roman" w:hAnsi="Times New Roman" w:cs="Times New Roman"/>
           <w:sz w:val="24"/>
         </w:rPr>
       </w:pPr>
       <w:r>
         <w:rPr>
-          <w:rFonts w:hint="eastAsia" w:ascii="Times New Roman" w:hAnsi="Times New Roman" w:cs="Times New Roman"/>
-          <w:sz w:val="24"/>
-        </w:rPr>
-        <w:t>As an aliphatic polyurethane resin with excellent yellowing resistance, PU-1001 is widely used for white and light-colored leathers.</w:t>
-      </w:r>
-    </w:p>
-    <w:p>
-      <w:pPr>
-        <w:spacing w:line="0" w:lineRule="atLeast"/>
-        <w:rPr>
-          <w:rFonts w:ascii="宋体" w:hAnsi="宋体" w:eastAsia="宋体" w:cs="Times New Roman"/>
-          <w:b/>
-          <w:sz w:val="28"/>
-        </w:rPr>
-      </w:pPr>
-      <w:r>
-        <w:rPr>
-          <w:rFonts w:ascii="宋体" w:hAnsi="宋体" w:eastAsia="宋体" w:cs="Times New Roman"/>
-          <w:b/>
-          <w:sz w:val="28"/>
-        </w:rPr>
-        <w:t>Storage</w:t>
-      </w:r>
-    </w:p>
-    <w:p>
-      <w:pPr>
-        <w:spacing w:line="0" w:lineRule="atLeast"/>
-        <w:rPr>
-          <w:rFonts w:ascii="宋体" w:hAnsi="宋体" w:cs="宋体"/>
-          <w:b/>
-          <w:sz w:val="13"/>
-          <w:szCs w:val="6"/>
-        </w:rPr>
-      </w:pPr>
-    </w:p>
-    <w:p>
-      <w:pPr>
-        <w:spacing w:line="324" w:lineRule="auto"/>
-        <w:ind w:left="0" w:leftChars="0" w:right="0" w:rightChars="0" w:firstLineChars="200"/>
-        <w:rPr>
-          <w:rFonts w:ascii="宋体" w:hAnsi="宋体"/>
-          <w:sz w:val="24"/>
-        </w:rPr>
-      </w:pPr>
-      <w:r>
-        <w:rPr>
-          <w:rFonts w:hint="eastAsia" w:ascii="Times New Roman" w:hAnsi="Times New Roman" w:cs="Times New Roman"/>
+          <w:rFonts w:ascii="Times New Roman" w:hAnsi="Times New Roman" w:cs="Times New Roman"/>
           <w:sz w:val="24"/>
         </w:rPr>
         <w:t>Store in a ventilated, dry area at 5-35°C; protect from freezing. Shelf life is 6 months from shipment. Products older than 6 months should be re-evaluated before use.</w:t>
@@ -1938,6 +1727,7 @@
     <w:qFormat/>
     <w:uiPriority w:val="0"/>
     <w:rPr>
+      <w:rFonts w:ascii="Times New Roman" w:hAnsi="Times New Roman" w:eastAsia="宋体" w:cs="Times New Roman"/>
       <w:lang w:val="en-US" w:eastAsia="zh-CN" w:bidi="ar-SA"/>
     </w:rPr>
   </w:style>
@@ -1951,9 +1741,7 @@
     <w:unhideWhenUsed/>
     <w:qFormat/>
     <w:uiPriority w:val="99"/>
-    <w:tblPr>
-      <w:tblStyle w:val="4"/>
-    </w:tblPr>
+    <w:tblPr/>
   </w:style>
   <w:style w:type="paragraph" w:styleId="2">
     <w:name w:val="footer"/>

</xml_diff>

<commit_message>
add adaptive TDS layout and page guards
</commit_message>
<xml_diff>
--- a/TDS Skill/templates/active/TDS_EN_冠志模板.docx
+++ b/TDS Skill/templates/active/TDS_EN_冠志模板.docx
@@ -254,11 +254,12 @@
     <w:p>
       <w:pPr>
         <w:spacing w:line="324" w:lineRule="auto"/>
-        <w:ind w:left="0" w:leftChars="0" w:right="0" w:rightChars="0"/>
+        <w:ind w:left="0" w:leftChars="0" w:right="0" w:rightChars="0" w:firstLineChars="200" w:firstLine="480"/>
         <w:rPr>
           <w:rFonts w:ascii="Times New Roman" w:hAnsi="Times New Roman" w:cs="Times New Roman"/>
           <w:sz w:val="24"/>
         </w:rPr>
+        <w:jc w:val="both"/>
       </w:pPr>
       <w:r>
         <w:rPr>
@@ -314,11 +315,12 @@
     <w:p>
       <w:pPr>
         <w:spacing w:line="324" w:lineRule="auto"/>
-        <w:ind w:left="0" w:leftChars="0" w:right="0" w:rightChars="0"/>
+        <w:ind w:left="0" w:leftChars="0" w:right="0" w:rightChars="0" w:firstLineChars="200" w:firstLine="480"/>
         <w:rPr>
           <w:rFonts w:ascii="Times New Roman" w:hAnsi="Times New Roman" w:cs="Times New Roman"/>
           <w:sz w:val="24"/>
         </w:rPr>
+        <w:jc w:val="both"/>
       </w:pPr>
       <w:r>
         <w:rPr>
@@ -1281,7 +1283,7 @@
           <w:numId w:val="1"/>
         </w:numPr>
         <w:spacing w:line="324" w:lineRule="auto"/>
-        <w:ind w:left="0" w:leftChars="0" w:right="0" w:rightChars="0"/>
+        <w:ind w:left="840" w:leftChars="0" w:right="0" w:rightChars="0" w:hanging="360"/>
         <w:rPr>
           <w:rFonts w:ascii="Times New Roman" w:hAnsi="Times New Roman" w:cs="Times New Roman"/>
           <w:sz w:val="24"/>
@@ -1302,7 +1304,7 @@
           <w:numId w:val="1"/>
         </w:numPr>
         <w:spacing w:line="324" w:lineRule="auto"/>
-        <w:ind w:left="0" w:leftChars="0" w:right="0" w:rightChars="0"/>
+        <w:ind w:left="840" w:leftChars="0" w:right="0" w:rightChars="0" w:hanging="360"/>
         <w:rPr>
           <w:rFonts w:ascii="Times New Roman" w:hAnsi="Times New Roman" w:cs="Times New Roman"/>
           <w:sz w:val="24"/>
@@ -1348,11 +1350,12 @@
     <w:p>
       <w:pPr>
         <w:spacing w:line="324" w:lineRule="auto"/>
-        <w:ind w:left="0" w:leftChars="0" w:right="0" w:rightChars="0"/>
+        <w:ind w:left="0" w:leftChars="0" w:right="0" w:rightChars="0" w:firstLineChars="200" w:firstLine="480"/>
         <w:rPr>
           <w:rFonts w:ascii="Times New Roman" w:hAnsi="Times New Roman" w:cs="Times New Roman"/>
           <w:sz w:val="24"/>
         </w:rPr>
+        <w:jc w:val="both"/>
       </w:pPr>
       <w:r>
         <w:rPr>
@@ -1407,11 +1410,12 @@
     <w:p>
       <w:pPr>
         <w:spacing w:line="324" w:lineRule="auto"/>
-        <w:ind w:left="0" w:leftChars="0" w:right="0" w:rightChars="0"/>
+        <w:ind w:left="0" w:leftChars="0" w:right="0" w:rightChars="0" w:firstLineChars="200" w:firstLine="480"/>
         <w:rPr>
           <w:rFonts w:ascii="Times New Roman" w:hAnsi="Times New Roman" w:cs="Times New Roman"/>
           <w:sz w:val="24"/>
         </w:rPr>
+        <w:jc w:val="both"/>
       </w:pPr>
       <w:r>
         <w:rPr>

</xml_diff>